<commit_message>
Set manuscript authors and advisor
</commit_message>
<xml_diff>
--- a/paper/manuscript.inha.docx
+++ b/paper/manuscript.inha.docx
@@ -33,7 +33,7 @@
         <w:jc w:val="center"/>
       </w:pPr>
       <w:r>
-        <w:t>________________</w:t>
+        <w:t>김미르, 장윤석</w:t>
       </w:r>
     </w:p>
     <w:p>
@@ -42,7 +42,7 @@
         <w:jc w:val="center"/>
       </w:pPr>
       <w:r>
-        <w:t>(________________)</w:t>
+        <w:t>(________________, ________________)</w:t>
       </w:r>
     </w:p>
     <w:p>
@@ -52,7 +52,7 @@
         <w:jc w:val="center"/>
       </w:pPr>
       <w:r>
-        <w:t>지도교수: ________________</w:t>
+        <w:t>지도교수: 안남혁</w:t>
       </w:r>
     </w:p>
     <w:p>
@@ -62,7 +62,7 @@
         <w:jc w:val="center"/>
       </w:pPr>
       <w:r>
-        <w:t>(________________)</w:t>
+        <w:t>(Namhyuk Ahn)</w:t>
       </w:r>
     </w:p>
     <w:p>

</xml_diff>

<commit_message>
Clarify Korean and English paper titles
</commit_message>
<xml_diff>
--- a/paper/manuscript.inha.docx
+++ b/paper/manuscript.inha.docx
@@ -10,9 +10,9 @@
         <w:jc w:val="center"/>
       </w:pPr>
       <w:r>
-        <w:t xml:space="preserve">비얼굴 순차 이미지 편집에서 얼굴 변화와 </w:t>
+        <w:t xml:space="preserve">반복 이미지 편집에서의 얼굴 보존과 </w:t>
         <w:br/>
-        <w:t>원본 기반 재생성의 탐색적 비교</w:t>
+        <w:t>원본 기반 재생성 비교</w:t>
       </w:r>
     </w:p>
     <w:p>
@@ -23,7 +23,7 @@
         <w:jc w:val="center"/>
       </w:pPr>
       <w:r>
-        <w:t>An Exploratory Comparison of Facial Change and Original-Referenced Regeneration in Sequential Non-Facial Image Editing</w:t>
+        <w:t>A Comparison of Facial Preservation and Original-Referenced Regeneration in Iterative Image Editing</w:t>
       </w:r>
     </w:p>
     <w:p>

</xml_diff>